<commit_message>
Fix Registry empty error logging + widen undersized VARCHAR columns; generate IIIF docx files
</commit_message>
<xml_diff>
--- a/ahgIiifPlugin/docs/AtoM_Heratio_IIIF_Compliance_Feature_Overview.docx
+++ b/ahgIiifPlugin/docs/AtoM_Heratio_IIIF_Compliance_Feature_Overview.docx
@@ -7,7 +7,7 @@
         <w:pStyle w:val="Title"/>
       </w:pPr>
       <w:r>
-        <w:t xml:space="preserve">AtoM Heratio — IIIF Compliance Hardening</w:t>
+        <w:t xml:space="preserve">AtoM Heratio IIIF Compliance Feature Overview</w:t>
       </w:r>
     </w:p>
     <w:p>
@@ -18,7 +18,7 @@
         <w:t xml:space="preserve">The Archive and Heritage Group (Pty) Ltd</w:t>
       </w:r>
     </w:p>
-    <w:bookmarkStart w:id="34" w:name="atom-heratio-iiif-compliance-hardening"/>
+    <w:bookmarkStart w:id="35" w:name="atom-heratio-iiif-compliance-hardening"/>
     <w:p>
       <w:pPr>
         <w:pStyle w:val="Heading1"/>
@@ -65,7 +65,19 @@
         <w:pStyle w:val="BodyText"/>
       </w:pPr>
       <w:r>
-        <w:t xml:space="preserve">This feature is part of the AtoM Heratio framework v2.8.2 by The Archive and Heritage Group (Pty) Ltd.</w:t>
+        <w:t xml:space="preserve">This feature is part of the AtoM Heratio framework v2.8.2 by The Archive and Heritage Group (Pty) Ltd. As of v1.3.0 (March 2026), Presentation API 3.0 is the default manifest format, with full backward compatibility via</w:t>
+      </w:r>
+      <w:r>
+        <w:t xml:space="preserve"> </w:t>
+      </w:r>
+      <w:r>
+        <w:rPr>
+          <w:rStyle w:val="VerbatimChar"/>
+        </w:rPr>
+        <w:t xml:space="preserve">?format=2</w:t>
+      </w:r>
+      <w:r>
+        <w:t xml:space="preserve">.</w:t>
       </w:r>
     </w:p>
     <w:bookmarkEnd w:id="20"/>
@@ -229,6 +241,91 @@
       </w:r>
       <w:r>
         <w:t xml:space="preserve">: Explicit width/height on thumbnail resources (200px scaled)</w:t>
+      </w:r>
+    </w:p>
+    <w:p>
+      <w:pPr>
+        <w:numPr>
+          <w:ilvl w:val="0"/>
+          <w:numId w:val="1001"/>
+        </w:numPr>
+        <w:pStyle w:val="Compact"/>
+      </w:pPr>
+      <w:r>
+        <w:rPr>
+          <w:bCs/>
+          <w:b/>
+        </w:rPr>
+        <w:t xml:space="preserve">v3 Default</w:t>
+      </w:r>
+      <w:r>
+        <w:t xml:space="preserve">: Presentation API 3.0 is now the default manifest format for all endpoints</w:t>
+      </w:r>
+    </w:p>
+    <w:p>
+      <w:pPr>
+        <w:numPr>
+          <w:ilvl w:val="0"/>
+          <w:numId w:val="1001"/>
+        </w:numPr>
+        <w:pStyle w:val="Compact"/>
+      </w:pPr>
+      <w:r>
+        <w:rPr>
+          <w:bCs/>
+          <w:b/>
+        </w:rPr>
+        <w:t xml:space="preserve">Multi-language Labels</w:t>
+      </w:r>
+      <w:r>
+        <w:t xml:space="preserve">: Manifest labels, summaries, and metadata populated from all available i18n cultures</w:t>
+      </w:r>
+    </w:p>
+    <w:p>
+      <w:pPr>
+        <w:numPr>
+          <w:ilvl w:val="0"/>
+          <w:numId w:val="1001"/>
+        </w:numPr>
+        <w:pStyle w:val="Compact"/>
+      </w:pPr>
+      <w:r>
+        <w:rPr>
+          <w:bCs/>
+          <w:b/>
+        </w:rPr>
+        <w:t xml:space="preserve">Comparison Viewer</w:t>
+      </w:r>
+      <w:r>
+        <w:t xml:space="preserve">: Side-by-side Mirador comparison at</w:t>
+      </w:r>
+      <w:r>
+        <w:t xml:space="preserve"> </w:t>
+      </w:r>
+      <w:r>
+        <w:rPr>
+          <w:rStyle w:val="VerbatimChar"/>
+        </w:rPr>
+        <w:t xml:space="preserve">/iiif/compare?slugs=slug1,slug2</w:t>
+      </w:r>
+    </w:p>
+    <w:p>
+      <w:pPr>
+        <w:numPr>
+          <w:ilvl w:val="0"/>
+          <w:numId w:val="1001"/>
+        </w:numPr>
+        <w:pStyle w:val="Compact"/>
+      </w:pPr>
+      <w:r>
+        <w:rPr>
+          <w:bCs/>
+          <w:b/>
+        </w:rPr>
+        <w:t xml:space="preserve">Research Annotation Bridge</w:t>
+      </w:r>
+      <w:r>
+        <w:t xml:space="preserve">: Canvas-linked annotations sync between ahgResearchPlugin and IIIF annotation store</w:t>
       </w:r>
     </w:p>
     <w:bookmarkEnd w:id="21"/>
@@ -1119,6 +1216,64 @@
           </w:p>
         </w:tc>
       </w:tr>
+      <w:tr>
+        <w:tc>
+          <w:tcPr/>
+          <w:p>
+            <w:pPr>
+              <w:pStyle w:val="Compact"/>
+              <w:jc w:val="left"/>
+            </w:pPr>
+            <w:r>
+              <w:rPr>
+                <w:rStyle w:val="VerbatimChar"/>
+              </w:rPr>
+              <w:t xml:space="preserve">/iiif/manifest/:slug</w:t>
+            </w:r>
+          </w:p>
+        </w:tc>
+        <w:tc>
+          <w:tcPr/>
+          <w:p>
+            <w:pPr>
+              <w:pStyle w:val="Compact"/>
+              <w:jc w:val="left"/>
+            </w:pPr>
+            <w:r>
+              <w:t xml:space="preserve">IIIF manifest (v3 default, ?format=2 for v2.1 fallback)</w:t>
+            </w:r>
+          </w:p>
+        </w:tc>
+      </w:tr>
+      <w:tr>
+        <w:tc>
+          <w:tcPr/>
+          <w:p>
+            <w:pPr>
+              <w:pStyle w:val="Compact"/>
+              <w:jc w:val="left"/>
+            </w:pPr>
+            <w:r>
+              <w:rPr>
+                <w:rStyle w:val="VerbatimChar"/>
+              </w:rPr>
+              <w:t xml:space="preserve">/iiif/compare</w:t>
+            </w:r>
+          </w:p>
+        </w:tc>
+        <w:tc>
+          <w:tcPr/>
+          <w:p>
+            <w:pPr>
+              <w:pStyle w:val="Compact"/>
+              <w:jc w:val="left"/>
+            </w:pPr>
+            <w:r>
+              <w:t xml:space="preserve">Side-by-side comparison viewer</w:t>
+            </w:r>
+          </w:p>
+        </w:tc>
+      </w:tr>
     </w:tbl>
     <w:bookmarkEnd w:id="29"/>
     <w:bookmarkEnd w:id="30"/>
@@ -1328,7 +1483,7 @@
         <w:rPr>
           <w:rStyle w:val="DataTypeTok"/>
         </w:rPr>
-        <w:t xml:space="preserve">"en"</w:t>
+        <w:t xml:space="preserve">"none"</w:t>
       </w:r>
       <w:r>
         <w:rPr>
@@ -2519,6 +2674,196 @@
       </w:r>
     </w:p>
     <w:p>
+      <w:pPr>
+        <w:numPr>
+          <w:ilvl w:val="0"/>
+          <w:numId w:val="1008"/>
+        </w:numPr>
+        <w:pStyle w:val="Compact"/>
+      </w:pPr>
+      <w:r>
+        <w:t xml:space="preserve">IIIF Authentication API 1.0</w:t>
+      </w:r>
+    </w:p>
+    <w:bookmarkEnd w:id="33"/>
+    <w:bookmarkStart w:id="34" w:name="version-history"/>
+    <w:p>
+      <w:pPr>
+        <w:pStyle w:val="Heading2"/>
+      </w:pPr>
+      <w:r>
+        <w:t xml:space="preserve">Version History</w:t>
+      </w:r>
+    </w:p>
+    <w:tbl>
+      <w:tblPr>
+        <w:tblStyle w:val="Table"/>
+        <w:tblW w:type="pct" w:w="5000"/>
+        <w:tblLook w:firstRow="1" w:lastRow="0" w:firstColumn="0" w:lastColumn="0" w:noHBand="0" w:noVBand="0" w:val="0020"/>
+        <w:jc w:val="start"/>
+      </w:tblPr>
+      <w:tblGrid>
+        <w:gridCol w:w="2970"/>
+        <w:gridCol w:w="1980"/>
+        <w:gridCol w:w="2970"/>
+      </w:tblGrid>
+      <w:tr>
+        <w:trPr>
+          <w:tblHeader w:val="true"/>
+        </w:trPr>
+        <w:tc>
+          <w:tcPr/>
+          <w:p>
+            <w:pPr>
+              <w:pStyle w:val="Compact"/>
+              <w:jc w:val="left"/>
+            </w:pPr>
+            <w:r>
+              <w:t xml:space="preserve">Version</w:t>
+            </w:r>
+          </w:p>
+        </w:tc>
+        <w:tc>
+          <w:tcPr/>
+          <w:p>
+            <w:pPr>
+              <w:pStyle w:val="Compact"/>
+              <w:jc w:val="left"/>
+            </w:pPr>
+            <w:r>
+              <w:t xml:space="preserve">Date</w:t>
+            </w:r>
+          </w:p>
+        </w:tc>
+        <w:tc>
+          <w:tcPr/>
+          <w:p>
+            <w:pPr>
+              <w:pStyle w:val="Compact"/>
+              <w:jc w:val="left"/>
+            </w:pPr>
+            <w:r>
+              <w:t xml:space="preserve">Changes</w:t>
+            </w:r>
+          </w:p>
+        </w:tc>
+      </w:tr>
+      <w:tr>
+        <w:tc>
+          <w:tcPr/>
+          <w:p>
+            <w:pPr>
+              <w:pStyle w:val="Compact"/>
+              <w:jc w:val="left"/>
+            </w:pPr>
+            <w:r>
+              <w:t xml:space="preserve">1.3.0</w:t>
+            </w:r>
+          </w:p>
+        </w:tc>
+        <w:tc>
+          <w:tcPr/>
+          <w:p>
+            <w:pPr>
+              <w:pStyle w:val="Compact"/>
+              <w:jc w:val="left"/>
+            </w:pPr>
+            <w:r>
+              <w:t xml:space="preserve">2026-03</w:t>
+            </w:r>
+          </w:p>
+        </w:tc>
+        <w:tc>
+          <w:tcPr/>
+          <w:p>
+            <w:pPr>
+              <w:pStyle w:val="Compact"/>
+              <w:jc w:val="left"/>
+            </w:pPr>
+            <w:r>
+              <w:t xml:space="preserve">M2-IIIF-Complete: v3 default, multi-language labels, compare viewer, CDN→local, annotation route fix</w:t>
+            </w:r>
+          </w:p>
+        </w:tc>
+      </w:tr>
+      <w:tr>
+        <w:tc>
+          <w:tcPr/>
+          <w:p>
+            <w:pPr>
+              <w:pStyle w:val="Compact"/>
+              <w:jc w:val="left"/>
+            </w:pPr>
+            <w:r>
+              <w:t xml:space="preserve">1.2.0</w:t>
+            </w:r>
+          </w:p>
+        </w:tc>
+        <w:tc>
+          <w:tcPr/>
+          <w:p>
+            <w:pPr>
+              <w:pStyle w:val="Compact"/>
+              <w:jc w:val="left"/>
+            </w:pPr>
+            <w:r>
+              <w:t xml:space="preserve">2026-02</w:t>
+            </w:r>
+          </w:p>
+        </w:tc>
+        <w:tc>
+          <w:tcPr/>
+          <w:p>
+            <w:pPr>
+              <w:pStyle w:val="Compact"/>
+              <w:jc w:val="left"/>
+            </w:pPr>
+            <w:r>
+              <w:t xml:space="preserve">Media streaming, annotations REST API, format conversion</w:t>
+            </w:r>
+          </w:p>
+        </w:tc>
+      </w:tr>
+      <w:tr>
+        <w:tc>
+          <w:tcPr/>
+          <w:p>
+            <w:pPr>
+              <w:pStyle w:val="Compact"/>
+              <w:jc w:val="left"/>
+            </w:pPr>
+            <w:r>
+              <w:t xml:space="preserve">1.0.0</w:t>
+            </w:r>
+          </w:p>
+        </w:tc>
+        <w:tc>
+          <w:tcPr/>
+          <w:p>
+            <w:pPr>
+              <w:pStyle w:val="Compact"/>
+              <w:jc w:val="left"/>
+            </w:pPr>
+            <w:r>
+              <w:t xml:space="preserve">2025-01</w:t>
+            </w:r>
+          </w:p>
+        </w:tc>
+        <w:tc>
+          <w:tcPr/>
+          <w:p>
+            <w:pPr>
+              <w:pStyle w:val="Compact"/>
+              <w:jc w:val="left"/>
+            </w:pPr>
+            <w:r>
+              <w:t xml:space="preserve">Initial IIIF compliance hardening release</w:t>
+            </w:r>
+          </w:p>
+        </w:tc>
+      </w:tr>
+    </w:tbl>
+    <w:p>
       <w:r>
         <w:pict>
           <v:rect style="width:0;height:1.5pt" o:hralign="center" o:hrstd="t" o:hr="t"/>
@@ -2547,8 +2892,8 @@
         <w:t xml:space="preserve">https://github.com/ArchiveHeritageGroup</w:t>
       </w:r>
     </w:p>
-    <w:bookmarkEnd w:id="33"/>
     <w:bookmarkEnd w:id="34"/>
+    <w:bookmarkEnd w:id="35"/>
     <w:sectPr/>
   </w:body>
 </w:document>

</xml_diff>